<commit_message>
Add system and data flow diagrams to the System & Architecture document
Six diagrams (system architecture, sign-in and access check, level-1 data
flow, stock posting sequence, adjustment approval, reports/backup) are
embedded in the Word document and kept as PNG/SVG in docs/diagrams.

Co-Authored-By: Claude Opus 5.5 <noreply@anthropic.com>
Claude-Session: https://claude.ai/code/session_01XixE8NEpkEt8magdsqESce
</commit_message>
<xml_diff>
--- a/docs/BCB-Berkeley Inventory - System and Architecture.docx
+++ b/docs/BCB-Berkeley Inventory - System and Architecture.docx
@@ -1984,6 +1984,81 @@
     </w:p>
     <w:p>
       <w:pPr>
+        <w:spacing w:after="120" w:line="288"/>
+      </w:pPr>
+      <w:r>
+        <w:rPr>
+          <w:rFonts w:ascii="Calibri" w:cs="Calibri" w:eastAsia="Calibri" w:hAnsi="Calibri"/>
+        </w:rPr>
+        <w:t xml:space="preserve">Figure A shows how the parts connect: the browser loads the app from Firebase Hosting, signs in through Firebase Authentication, and then talks directly to Cloud Firestore, where the Security Rules check every request.</w:t>
+      </w:r>
+    </w:p>
+    <w:p>
+      <w:pPr>
+        <w:keepNext/>
+        <w:spacing w:after="40" w:before="60"/>
+        <w:jc w:val="center"/>
+      </w:pPr>
+      <w:r>
+        <w:drawing>
+          <wp:inline distT="0" distB="0" distL="0" distR="0">
+            <wp:extent cx="5762625" cy="3714750"/>
+            <wp:effectExtent t="0" r="0" b="0" l="0"/>
+            <wp:docPr id="1" name="Figure A. System architecture: browser, Firebase services and public CDNs" descr="Figure A. System architecture: browser, Firebase services and public CDNs" title="Figure A. System architecture: browser, Firebase services and public CDNs"/>
+            <wp:cNvGraphicFramePr>
+              <a:graphicFrameLocks xmlns:a="http://schemas.openxmlformats.org/drawingml/2006/main" noChangeAspect="1"/>
+            </wp:cNvGraphicFramePr>
+            <a:graphic xmlns:a="http://schemas.openxmlformats.org/drawingml/2006/main">
+              <a:graphicData uri="http://schemas.openxmlformats.org/drawingml/2006/picture">
+                <pic:pic xmlns:pic="http://schemas.openxmlformats.org/drawingml/2006/picture">
+                  <pic:nvPicPr>
+                    <pic:cNvPr id="0" name="" descr=""/>
+                    <pic:cNvPicPr>
+                      <a:picLocks noChangeAspect="1" noChangeArrowheads="1"/>
+                    </pic:cNvPicPr>
+                  </pic:nvPicPr>
+                  <pic:blipFill>
+                    <a:blip r:embed="rId11" cstate="none"/>
+                    <a:srcRect/>
+                    <a:stretch>
+                      <a:fillRect/>
+                    </a:stretch>
+                  </pic:blipFill>
+                  <pic:spPr bwMode="auto">
+                    <a:xfrm>
+                      <a:off x="0" y="0"/>
+                      <a:ext cx="5762625" cy="3714750"/>
+                    </a:xfrm>
+                    <a:prstGeom prst="rect">
+                      <a:avLst/>
+                    </a:prstGeom>
+                  </pic:spPr>
+                </pic:pic>
+              </a:graphicData>
+            </a:graphic>
+          </wp:inline>
+        </w:drawing>
+      </w:r>
+    </w:p>
+    <w:p>
+      <w:pPr>
+        <w:spacing w:after="200"/>
+        <w:jc w:val="center"/>
+      </w:pPr>
+      <w:r>
+        <w:rPr>
+          <w:rFonts w:ascii="Calibri" w:cs="Calibri" w:eastAsia="Calibri" w:hAnsi="Calibri"/>
+          <w:i/>
+          <w:iCs/>
+          <w:color w:val="52707A"/>
+          <w:sz w:val="18"/>
+          <w:szCs w:val="18"/>
+        </w:rPr>
+        <w:t xml:space="preserve">Figure A. System architecture: browser, Firebase services and public CDNs</w:t>
+      </w:r>
+    </w:p>
+    <w:p>
+      <w:pPr>
         <w:pStyle w:val="Heading2"/>
       </w:pPr>
       <w:r>
@@ -2266,6 +2341,70 @@
           <w:rFonts w:ascii="Calibri" w:cs="Calibri" w:eastAsia="Calibri" w:hAnsi="Calibri"/>
         </w:rPr>
         <w:t xml:space="preserve">Writes go straight from the browser to Firestore. Security Rules accept or reject each one based on the signed-in user's role.</w:t>
+      </w:r>
+    </w:p>
+    <w:p>
+      <w:pPr>
+        <w:keepNext/>
+        <w:spacing w:after="40" w:before="60"/>
+        <w:jc w:val="center"/>
+      </w:pPr>
+      <w:r>
+        <w:drawing>
+          <wp:inline distT="0" distB="0" distL="0" distR="0">
+            <wp:extent cx="5762625" cy="3248025"/>
+            <wp:effectExtent t="0" r="0" b="0" l="0"/>
+            <wp:docPr id="1" name="Figure B. Sign-in and access check (steps 2–4 above)" descr="Figure B. Sign-in and access check (steps 2–4 above)" title="Figure B. Sign-in and access check (steps 2–4 above)"/>
+            <wp:cNvGraphicFramePr>
+              <a:graphicFrameLocks xmlns:a="http://schemas.openxmlformats.org/drawingml/2006/main" noChangeAspect="1"/>
+            </wp:cNvGraphicFramePr>
+            <a:graphic xmlns:a="http://schemas.openxmlformats.org/drawingml/2006/main">
+              <a:graphicData uri="http://schemas.openxmlformats.org/drawingml/2006/picture">
+                <pic:pic xmlns:pic="http://schemas.openxmlformats.org/drawingml/2006/picture">
+                  <pic:nvPicPr>
+                    <pic:cNvPr id="0" name="" descr=""/>
+                    <pic:cNvPicPr>
+                      <a:picLocks noChangeAspect="1" noChangeArrowheads="1"/>
+                    </pic:cNvPicPr>
+                  </pic:nvPicPr>
+                  <pic:blipFill>
+                    <a:blip r:embed="rId12" cstate="none"/>
+                    <a:srcRect/>
+                    <a:stretch>
+                      <a:fillRect/>
+                    </a:stretch>
+                  </pic:blipFill>
+                  <pic:spPr bwMode="auto">
+                    <a:xfrm>
+                      <a:off x="0" y="0"/>
+                      <a:ext cx="5762625" cy="3248025"/>
+                    </a:xfrm>
+                    <a:prstGeom prst="rect">
+                      <a:avLst/>
+                    </a:prstGeom>
+                  </pic:spPr>
+                </pic:pic>
+              </a:graphicData>
+            </a:graphic>
+          </wp:inline>
+        </w:drawing>
+      </w:r>
+    </w:p>
+    <w:p>
+      <w:pPr>
+        <w:spacing w:after="200"/>
+        <w:jc w:val="center"/>
+      </w:pPr>
+      <w:r>
+        <w:rPr>
+          <w:rFonts w:ascii="Calibri" w:cs="Calibri" w:eastAsia="Calibri" w:hAnsi="Calibri"/>
+          <w:i/>
+          <w:iCs/>
+          <w:color w:val="52707A"/>
+          <w:sz w:val="18"/>
+          <w:szCs w:val="18"/>
+        </w:rPr>
+        <w:t xml:space="preserve">Figure B. Sign-in and access check (steps 2–4 above)</w:t>
       </w:r>
     </w:p>
     <w:tbl>
@@ -2348,6 +2487,992 @@
     <w:p>
       <w:pPr>
         <w:spacing w:after="100"/>
+      </w:pPr>
+    </w:p>
+    <w:p>
+      <w:pPr>
+        <w:pStyle w:val="Heading2"/>
+      </w:pPr>
+      <w:r>
+        <w:rPr>
+          <w:rFonts w:ascii="Calibri" w:cs="Calibri" w:eastAsia="Calibri" w:hAnsi="Calibri"/>
+        </w:rPr>
+        <w:t xml:space="preserve">2.2 Data flow</w:t>
+      </w:r>
+    </w:p>
+    <w:p>
+      <w:pPr>
+        <w:spacing w:after="120" w:line="288"/>
+      </w:pPr>
+      <w:r>
+        <w:rPr>
+          <w:rFonts w:ascii="Calibri" w:cs="Calibri" w:eastAsia="Calibri" w:hAnsi="Calibri"/>
+        </w:rPr>
+        <w:t xml:space="preserve">Figure C is a level-1 data flow diagram. Six processes run in the browser; six Firestore collections hold the data. Every stock-changing flow (orange) goes through the single </w:t>
+      </w:r>
+      <w:r>
+        <w:rPr>
+          <w:rFonts w:ascii="Consolas" w:cs="Consolas" w:eastAsia="Consolas" w:hAnsi="Consolas"/>
+          <w:color w:val="186F90"/>
+          <w:sz w:val="20"/>
+          <w:szCs w:val="20"/>
+        </w:rPr>
+        <w:t xml:space="preserve">post()</w:t>
+      </w:r>
+      <w:r>
+        <w:rPr>
+          <w:rFonts w:ascii="Calibri" w:cs="Calibri" w:eastAsia="Calibri" w:hAnsi="Calibri"/>
+        </w:rPr>
+        <w:t xml:space="preserve"> code path and is written inside one Firestore transaction, so </w:t>
+      </w:r>
+      <w:r>
+        <w:rPr>
+          <w:rFonts w:ascii="Consolas" w:cs="Consolas" w:eastAsia="Consolas" w:hAnsi="Consolas"/>
+          <w:color w:val="186F90"/>
+          <w:sz w:val="20"/>
+          <w:szCs w:val="20"/>
+        </w:rPr>
+        <w:t xml:space="preserve">items.cur</w:t>
+      </w:r>
+      <w:r>
+        <w:rPr>
+          <w:rFonts w:ascii="Calibri" w:cs="Calibri" w:eastAsia="Calibri" w:hAnsi="Calibri"/>
+        </w:rPr>
+        <w:t xml:space="preserve"> and the ledger never disagree.</w:t>
+      </w:r>
+    </w:p>
+    <w:p>
+      <w:pPr>
+        <w:keepNext/>
+        <w:spacing w:after="40" w:before="60"/>
+        <w:jc w:val="center"/>
+      </w:pPr>
+      <w:r>
+        <w:drawing>
+          <wp:inline distT="0" distB="0" distL="0" distR="0">
+            <wp:extent cx="5762625" cy="3857625"/>
+            <wp:effectExtent t="0" r="0" b="0" l="0"/>
+            <wp:docPr id="1" name="Figure C. Data flow diagram (level 1): who sends what to which collection" descr="Figure C. Data flow diagram (level 1): who sends what to which collection" title="Figure C. Data flow diagram (level 1): who sends what to which collection"/>
+            <wp:cNvGraphicFramePr>
+              <a:graphicFrameLocks xmlns:a="http://schemas.openxmlformats.org/drawingml/2006/main" noChangeAspect="1"/>
+            </wp:cNvGraphicFramePr>
+            <a:graphic xmlns:a="http://schemas.openxmlformats.org/drawingml/2006/main">
+              <a:graphicData uri="http://schemas.openxmlformats.org/drawingml/2006/picture">
+                <pic:pic xmlns:pic="http://schemas.openxmlformats.org/drawingml/2006/picture">
+                  <pic:nvPicPr>
+                    <pic:cNvPr id="0" name="" descr=""/>
+                    <pic:cNvPicPr>
+                      <a:picLocks noChangeAspect="1" noChangeArrowheads="1"/>
+                    </pic:cNvPicPr>
+                  </pic:nvPicPr>
+                  <pic:blipFill>
+                    <a:blip r:embed="rId13" cstate="none"/>
+                    <a:srcRect/>
+                    <a:stretch>
+                      <a:fillRect/>
+                    </a:stretch>
+                  </pic:blipFill>
+                  <pic:spPr bwMode="auto">
+                    <a:xfrm>
+                      <a:off x="0" y="0"/>
+                      <a:ext cx="5762625" cy="3857625"/>
+                    </a:xfrm>
+                    <a:prstGeom prst="rect">
+                      <a:avLst/>
+                    </a:prstGeom>
+                  </pic:spPr>
+                </pic:pic>
+              </a:graphicData>
+            </a:graphic>
+          </wp:inline>
+        </w:drawing>
+      </w:r>
+    </w:p>
+    <w:p>
+      <w:pPr>
+        <w:spacing w:after="200"/>
+        <w:jc w:val="center"/>
+      </w:pPr>
+      <w:r>
+        <w:rPr>
+          <w:rFonts w:ascii="Calibri" w:cs="Calibri" w:eastAsia="Calibri" w:hAnsi="Calibri"/>
+          <w:i/>
+          <w:iCs/>
+          <w:color w:val="52707A"/>
+          <w:sz w:val="18"/>
+          <w:szCs w:val="18"/>
+        </w:rPr>
+        <w:t xml:space="preserve">Figure C. Data flow diagram (level 1): who sends what to which collection</w:t>
+      </w:r>
+    </w:p>
+    <w:tbl>
+      <w:tblPr>
+        <w:tblW w:type="dxa" w:w="9026"/>
+        <w:tblBorders>
+          <w:top w:val="single" w:color="auto" w:sz="4"/>
+          <w:left w:val="single" w:color="auto" w:sz="4"/>
+          <w:bottom w:val="single" w:color="auto" w:sz="4"/>
+          <w:right w:val="single" w:color="auto" w:sz="4"/>
+          <w:insideH w:val="single" w:color="auto" w:sz="4"/>
+          <w:insideV w:val="single" w:color="auto" w:sz="4"/>
+        </w:tblBorders>
+      </w:tblPr>
+      <w:tblGrid>
+        <w:gridCol w:w="1900"/>
+        <w:gridCol w:w="3300"/>
+        <w:gridCol w:w="3826"/>
+      </w:tblGrid>
+      <w:tr>
+        <w:trPr>
+          <w:tblHeader/>
+        </w:trPr>
+        <w:tc>
+          <w:tcPr>
+            <w:tcW w:type="dxa" w:w="1900"/>
+            <w:tcBorders>
+              <w:top w:val="single" w:color="C9DCE2" w:sz="4"/>
+              <w:left w:val="single" w:color="C9DCE2" w:sz="4"/>
+              <w:bottom w:val="single" w:color="C9DCE2" w:sz="4"/>
+              <w:right w:val="single" w:color="C9DCE2" w:sz="4"/>
+            </w:tcBorders>
+            <w:shd w:fill="1E7FA3" w:color="auto" w:val="clear"/>
+            <w:tcMar>
+              <w:top w:type="dxa" w:w="70"/>
+              <w:left w:type="dxa" w:w="110"/>
+              <w:bottom w:type="dxa" w:w="70"/>
+              <w:right w:type="dxa" w:w="110"/>
+            </w:tcMar>
+            <w:vAlign w:val="top"/>
+          </w:tcPr>
+          <w:p>
+            <w:pPr>
+              <w:spacing w:after="30" w:line="252"/>
+            </w:pPr>
+            <w:r>
+              <w:rPr>
+                <w:rFonts w:ascii="Calibri" w:cs="Calibri" w:eastAsia="Calibri" w:hAnsi="Calibri"/>
+                <w:b/>
+                <w:bCs/>
+                <w:color w:val="FFFFFF"/>
+                <w:sz w:val="19"/>
+                <w:szCs w:val="19"/>
+              </w:rPr>
+              <w:t xml:space="preserve">Flow</w:t>
+            </w:r>
+          </w:p>
+        </w:tc>
+        <w:tc>
+          <w:tcPr>
+            <w:tcW w:type="dxa" w:w="3300"/>
+            <w:tcBorders>
+              <w:top w:val="single" w:color="C9DCE2" w:sz="4"/>
+              <w:left w:val="single" w:color="C9DCE2" w:sz="4"/>
+              <w:bottom w:val="single" w:color="C9DCE2" w:sz="4"/>
+              <w:right w:val="single" w:color="C9DCE2" w:sz="4"/>
+            </w:tcBorders>
+            <w:shd w:fill="1E7FA3" w:color="auto" w:val="clear"/>
+            <w:tcMar>
+              <w:top w:type="dxa" w:w="70"/>
+              <w:left w:type="dxa" w:w="110"/>
+              <w:bottom w:type="dxa" w:w="70"/>
+              <w:right w:type="dxa" w:w="110"/>
+            </w:tcMar>
+            <w:vAlign w:val="top"/>
+          </w:tcPr>
+          <w:p>
+            <w:pPr>
+              <w:spacing w:after="30" w:line="252"/>
+            </w:pPr>
+            <w:r>
+              <w:rPr>
+                <w:rFonts w:ascii="Calibri" w:cs="Calibri" w:eastAsia="Calibri" w:hAnsi="Calibri"/>
+                <w:b/>
+                <w:bCs/>
+                <w:color w:val="FFFFFF"/>
+                <w:sz w:val="19"/>
+                <w:szCs w:val="19"/>
+              </w:rPr>
+              <w:t xml:space="preserve">From → To</w:t>
+            </w:r>
+          </w:p>
+        </w:tc>
+        <w:tc>
+          <w:tcPr>
+            <w:tcW w:type="dxa" w:w="3826"/>
+            <w:tcBorders>
+              <w:top w:val="single" w:color="C9DCE2" w:sz="4"/>
+              <w:left w:val="single" w:color="C9DCE2" w:sz="4"/>
+              <w:bottom w:val="single" w:color="C9DCE2" w:sz="4"/>
+              <w:right w:val="single" w:color="C9DCE2" w:sz="4"/>
+            </w:tcBorders>
+            <w:shd w:fill="1E7FA3" w:color="auto" w:val="clear"/>
+            <w:tcMar>
+              <w:top w:type="dxa" w:w="70"/>
+              <w:left w:type="dxa" w:w="110"/>
+              <w:bottom w:type="dxa" w:w="70"/>
+              <w:right w:type="dxa" w:w="110"/>
+            </w:tcMar>
+            <w:vAlign w:val="top"/>
+          </w:tcPr>
+          <w:p>
+            <w:pPr>
+              <w:spacing w:after="30" w:line="252"/>
+            </w:pPr>
+            <w:r>
+              <w:rPr>
+                <w:rFonts w:ascii="Calibri" w:cs="Calibri" w:eastAsia="Calibri" w:hAnsi="Calibri"/>
+                <w:b/>
+                <w:bCs/>
+                <w:color w:val="FFFFFF"/>
+                <w:sz w:val="19"/>
+                <w:szCs w:val="19"/>
+              </w:rPr>
+              <w:t xml:space="preserve">Data</w:t>
+            </w:r>
+          </w:p>
+        </w:tc>
+      </w:tr>
+      <w:tr>
+        <w:trPr>
+          <w:tblHeader w:val="false"/>
+        </w:trPr>
+        <w:tc>
+          <w:tcPr>
+            <w:tcW w:type="dxa" w:w="1900"/>
+            <w:tcBorders>
+              <w:top w:val="single" w:color="C9DCE2" w:sz="4"/>
+              <w:left w:val="single" w:color="C9DCE2" w:sz="4"/>
+              <w:bottom w:val="single" w:color="C9DCE2" w:sz="4"/>
+              <w:right w:val="single" w:color="C9DCE2" w:sz="4"/>
+            </w:tcBorders>
+            <w:tcMar>
+              <w:top w:type="dxa" w:w="70"/>
+              <w:left w:type="dxa" w:w="110"/>
+              <w:bottom w:type="dxa" w:w="70"/>
+              <w:right w:type="dxa" w:w="110"/>
+            </w:tcMar>
+            <w:vAlign w:val="top"/>
+          </w:tcPr>
+          <w:p>
+            <w:pPr>
+              <w:spacing w:after="30" w:line="252"/>
+            </w:pPr>
+            <w:r>
+              <w:rPr>
+                <w:rFonts w:ascii="Calibri" w:cs="Calibri" w:eastAsia="Calibri" w:hAnsi="Calibri"/>
+                <w:sz w:val="19"/>
+                <w:szCs w:val="19"/>
+              </w:rPr>
+              <w:t xml:space="preserve">Item maintenance</w:t>
+            </w:r>
+          </w:p>
+        </w:tc>
+        <w:tc>
+          <w:tcPr>
+            <w:tcW w:type="dxa" w:w="3300"/>
+            <w:tcBorders>
+              <w:top w:val="single" w:color="C9DCE2" w:sz="4"/>
+              <w:left w:val="single" w:color="C9DCE2" w:sz="4"/>
+              <w:bottom w:val="single" w:color="C9DCE2" w:sz="4"/>
+              <w:right w:val="single" w:color="C9DCE2" w:sz="4"/>
+            </w:tcBorders>
+            <w:tcMar>
+              <w:top w:type="dxa" w:w="70"/>
+              <w:left w:type="dxa" w:w="110"/>
+              <w:bottom w:type="dxa" w:w="70"/>
+              <w:right w:type="dxa" w:w="110"/>
+            </w:tcMar>
+            <w:vAlign w:val="top"/>
+          </w:tcPr>
+          <w:p>
+            <w:pPr>
+              <w:spacing w:after="30" w:line="252"/>
+            </w:pPr>
+            <w:r>
+              <w:rPr>
+                <w:rFonts w:ascii="Calibri" w:cs="Calibri" w:eastAsia="Calibri" w:hAnsi="Calibri"/>
+                <w:sz w:val="19"/>
+                <w:szCs w:val="19"/>
+              </w:rPr>
+              <w:t xml:space="preserve">Staff / Admin → P1 → items</w:t>
+            </w:r>
+          </w:p>
+        </w:tc>
+        <w:tc>
+          <w:tcPr>
+            <w:tcW w:type="dxa" w:w="3826"/>
+            <w:tcBorders>
+              <w:top w:val="single" w:color="C9DCE2" w:sz="4"/>
+              <w:left w:val="single" w:color="C9DCE2" w:sz="4"/>
+              <w:bottom w:val="single" w:color="C9DCE2" w:sz="4"/>
+              <w:right w:val="single" w:color="C9DCE2" w:sz="4"/>
+            </w:tcBorders>
+            <w:tcMar>
+              <w:top w:type="dxa" w:w="70"/>
+              <w:left w:type="dxa" w:w="110"/>
+              <w:bottom w:type="dxa" w:w="70"/>
+              <w:right w:type="dxa" w:w="110"/>
+            </w:tcMar>
+            <w:vAlign w:val="top"/>
+          </w:tcPr>
+          <w:p>
+            <w:pPr>
+              <w:spacing w:after="30" w:line="252"/>
+            </w:pPr>
+            <w:r>
+              <w:rPr>
+                <w:rFonts w:ascii="Calibri" w:cs="Calibri" w:eastAsia="Calibri" w:hAnsi="Calibri"/>
+                <w:sz w:val="19"/>
+                <w:szCs w:val="19"/>
+              </w:rPr>
+              <w:t xml:space="preserve">Item master fields; Excel import creates items in bulk.</w:t>
+            </w:r>
+          </w:p>
+        </w:tc>
+      </w:tr>
+      <w:tr>
+        <w:trPr>
+          <w:tblHeader w:val="false"/>
+        </w:trPr>
+        <w:tc>
+          <w:tcPr>
+            <w:tcW w:type="dxa" w:w="1900"/>
+            <w:tcBorders>
+              <w:top w:val="single" w:color="C9DCE2" w:sz="4"/>
+              <w:left w:val="single" w:color="C9DCE2" w:sz="4"/>
+              <w:bottom w:val="single" w:color="C9DCE2" w:sz="4"/>
+              <w:right w:val="single" w:color="C9DCE2" w:sz="4"/>
+            </w:tcBorders>
+            <w:tcMar>
+              <w:top w:type="dxa" w:w="70"/>
+              <w:left w:type="dxa" w:w="110"/>
+              <w:bottom w:type="dxa" w:w="70"/>
+              <w:right w:type="dxa" w:w="110"/>
+            </w:tcMar>
+            <w:vAlign w:val="top"/>
+          </w:tcPr>
+          <w:p>
+            <w:pPr>
+              <w:spacing w:after="30" w:line="252"/>
+            </w:pPr>
+            <w:r>
+              <w:rPr>
+                <w:rFonts w:ascii="Calibri" w:cs="Calibri" w:eastAsia="Calibri" w:hAnsi="Calibri"/>
+                <w:sz w:val="19"/>
+                <w:szCs w:val="19"/>
+              </w:rPr>
+              <w:t xml:space="preserve">Stock movement</w:t>
+            </w:r>
+          </w:p>
+        </w:tc>
+        <w:tc>
+          <w:tcPr>
+            <w:tcW w:type="dxa" w:w="3300"/>
+            <w:tcBorders>
+              <w:top w:val="single" w:color="C9DCE2" w:sz="4"/>
+              <w:left w:val="single" w:color="C9DCE2" w:sz="4"/>
+              <w:bottom w:val="single" w:color="C9DCE2" w:sz="4"/>
+              <w:right w:val="single" w:color="C9DCE2" w:sz="4"/>
+            </w:tcBorders>
+            <w:tcMar>
+              <w:top w:type="dxa" w:w="70"/>
+              <w:left w:type="dxa" w:w="110"/>
+              <w:bottom w:type="dxa" w:w="70"/>
+              <w:right w:type="dxa" w:w="110"/>
+            </w:tcMar>
+            <w:vAlign w:val="top"/>
+          </w:tcPr>
+          <w:p>
+            <w:pPr>
+              <w:spacing w:after="30" w:line="252"/>
+            </w:pPr>
+            <w:r>
+              <w:rPr>
+                <w:rFonts w:ascii="Calibri" w:cs="Calibri" w:eastAsia="Calibri" w:hAnsi="Calibri"/>
+                <w:sz w:val="19"/>
+                <w:szCs w:val="19"/>
+              </w:rPr>
+              <w:t xml:space="preserve">Staff / Admin → P2 → ledger + items</w:t>
+            </w:r>
+          </w:p>
+        </w:tc>
+        <w:tc>
+          <w:tcPr>
+            <w:tcW w:type="dxa" w:w="3826"/>
+            <w:tcBorders>
+              <w:top w:val="single" w:color="C9DCE2" w:sz="4"/>
+              <w:left w:val="single" w:color="C9DCE2" w:sz="4"/>
+              <w:bottom w:val="single" w:color="C9DCE2" w:sz="4"/>
+              <w:right w:val="single" w:color="C9DCE2" w:sz="4"/>
+            </w:tcBorders>
+            <w:tcMar>
+              <w:top w:type="dxa" w:w="70"/>
+              <w:left w:type="dxa" w:w="110"/>
+              <w:bottom w:type="dxa" w:w="70"/>
+              <w:right w:type="dxa" w:w="110"/>
+            </w:tcMar>
+            <w:vAlign w:val="top"/>
+          </w:tcPr>
+          <w:p>
+            <w:pPr>
+              <w:spacing w:after="30" w:line="252"/>
+            </w:pPr>
+            <w:r>
+              <w:rPr>
+                <w:rFonts w:ascii="Calibri" w:cs="Calibri" w:eastAsia="Calibri" w:hAnsi="Calibri"/>
+                <w:sz w:val="19"/>
+                <w:szCs w:val="19"/>
+              </w:rPr>
+              <w:t xml:space="preserve">Ledger entry (qin/qout, bal, party, purpose, cost) and the new </w:t>
+            </w:r>
+            <w:r>
+              <w:rPr>
+                <w:rFonts w:ascii="Consolas" w:cs="Consolas" w:eastAsia="Consolas" w:hAnsi="Consolas"/>
+                <w:color w:val="186F90"/>
+                <w:sz w:val="18"/>
+                <w:szCs w:val="18"/>
+              </w:rPr>
+              <w:t xml:space="preserve">cur</w:t>
+            </w:r>
+            <w:r>
+              <w:rPr>
+                <w:rFonts w:ascii="Calibri" w:cs="Calibri" w:eastAsia="Calibri" w:hAnsi="Calibri"/>
+                <w:sz w:val="19"/>
+                <w:szCs w:val="19"/>
+              </w:rPr>
+              <w:t xml:space="preserve"> / </w:t>
+            </w:r>
+            <w:r>
+              <w:rPr>
+                <w:rFonts w:ascii="Consolas" w:cs="Consolas" w:eastAsia="Consolas" w:hAnsi="Consolas"/>
+                <w:color w:val="186F90"/>
+                <w:sz w:val="18"/>
+                <w:szCs w:val="18"/>
+              </w:rPr>
+              <w:t xml:space="preserve">cost</w:t>
+            </w:r>
+            <w:r>
+              <w:rPr>
+                <w:rFonts w:ascii="Calibri" w:cs="Calibri" w:eastAsia="Calibri" w:hAnsi="Calibri"/>
+                <w:sz w:val="19"/>
+                <w:szCs w:val="19"/>
+              </w:rPr>
+              <w:t xml:space="preserve">.</w:t>
+            </w:r>
+          </w:p>
+        </w:tc>
+      </w:tr>
+      <w:tr>
+        <w:trPr>
+          <w:tblHeader w:val="false"/>
+        </w:trPr>
+        <w:tc>
+          <w:tcPr>
+            <w:tcW w:type="dxa" w:w="1900"/>
+            <w:tcBorders>
+              <w:top w:val="single" w:color="C9DCE2" w:sz="4"/>
+              <w:left w:val="single" w:color="C9DCE2" w:sz="4"/>
+              <w:bottom w:val="single" w:color="C9DCE2" w:sz="4"/>
+              <w:right w:val="single" w:color="C9DCE2" w:sz="4"/>
+            </w:tcBorders>
+            <w:tcMar>
+              <w:top w:type="dxa" w:w="70"/>
+              <w:left w:type="dxa" w:w="110"/>
+              <w:bottom w:type="dxa" w:w="70"/>
+              <w:right w:type="dxa" w:w="110"/>
+            </w:tcMar>
+            <w:vAlign w:val="top"/>
+          </w:tcPr>
+          <w:p>
+            <w:pPr>
+              <w:spacing w:after="30" w:line="252"/>
+            </w:pPr>
+            <w:r>
+              <w:rPr>
+                <w:rFonts w:ascii="Calibri" w:cs="Calibri" w:eastAsia="Calibri" w:hAnsi="Calibri"/>
+                <w:sz w:val="19"/>
+                <w:szCs w:val="19"/>
+              </w:rPr>
+              <w:t xml:space="preserve">Adjustment</w:t>
+            </w:r>
+          </w:p>
+        </w:tc>
+        <w:tc>
+          <w:tcPr>
+            <w:tcW w:type="dxa" w:w="3300"/>
+            <w:tcBorders>
+              <w:top w:val="single" w:color="C9DCE2" w:sz="4"/>
+              <w:left w:val="single" w:color="C9DCE2" w:sz="4"/>
+              <w:bottom w:val="single" w:color="C9DCE2" w:sz="4"/>
+              <w:right w:val="single" w:color="C9DCE2" w:sz="4"/>
+            </w:tcBorders>
+            <w:tcMar>
+              <w:top w:type="dxa" w:w="70"/>
+              <w:left w:type="dxa" w:w="110"/>
+              <w:bottom w:type="dxa" w:w="70"/>
+              <w:right w:type="dxa" w:w="110"/>
+            </w:tcMar>
+            <w:vAlign w:val="top"/>
+          </w:tcPr>
+          <w:p>
+            <w:pPr>
+              <w:spacing w:after="30" w:line="252"/>
+            </w:pPr>
+            <w:r>
+              <w:rPr>
+                <w:rFonts w:ascii="Calibri" w:cs="Calibri" w:eastAsia="Calibri" w:hAnsi="Calibri"/>
+                <w:sz w:val="19"/>
+                <w:szCs w:val="19"/>
+              </w:rPr>
+              <w:t xml:space="preserve">Staff → P3 → adjustments; Admin → P3 → ledger + items</w:t>
+            </w:r>
+          </w:p>
+        </w:tc>
+        <w:tc>
+          <w:tcPr>
+            <w:tcW w:type="dxa" w:w="3826"/>
+            <w:tcBorders>
+              <w:top w:val="single" w:color="C9DCE2" w:sz="4"/>
+              <w:left w:val="single" w:color="C9DCE2" w:sz="4"/>
+              <w:bottom w:val="single" w:color="C9DCE2" w:sz="4"/>
+              <w:right w:val="single" w:color="C9DCE2" w:sz="4"/>
+            </w:tcBorders>
+            <w:tcMar>
+              <w:top w:type="dxa" w:w="70"/>
+              <w:left w:type="dxa" w:w="110"/>
+              <w:bottom w:type="dxa" w:w="70"/>
+              <w:right w:type="dxa" w:w="110"/>
+            </w:tcMar>
+            <w:vAlign w:val="top"/>
+          </w:tcPr>
+          <w:p>
+            <w:pPr>
+              <w:spacing w:after="30" w:line="252"/>
+            </w:pPr>
+            <w:r>
+              <w:rPr>
+                <w:rFonts w:ascii="Calibri" w:cs="Calibri" w:eastAsia="Calibri" w:hAnsi="Calibri"/>
+                <w:sz w:val="19"/>
+                <w:szCs w:val="19"/>
+              </w:rPr>
+              <w:t xml:space="preserve">AR request (PENDING); on approval an SA ledger entry and the counted balance.</w:t>
+            </w:r>
+          </w:p>
+        </w:tc>
+      </w:tr>
+      <w:tr>
+        <w:trPr>
+          <w:tblHeader w:val="false"/>
+        </w:trPr>
+        <w:tc>
+          <w:tcPr>
+            <w:tcW w:type="dxa" w:w="1900"/>
+            <w:tcBorders>
+              <w:top w:val="single" w:color="C9DCE2" w:sz="4"/>
+              <w:left w:val="single" w:color="C9DCE2" w:sz="4"/>
+              <w:bottom w:val="single" w:color="C9DCE2" w:sz="4"/>
+              <w:right w:val="single" w:color="C9DCE2" w:sz="4"/>
+            </w:tcBorders>
+            <w:tcMar>
+              <w:top w:type="dxa" w:w="70"/>
+              <w:left w:type="dxa" w:w="110"/>
+              <w:bottom w:type="dxa" w:w="70"/>
+              <w:right w:type="dxa" w:w="110"/>
+            </w:tcMar>
+            <w:vAlign w:val="top"/>
+          </w:tcPr>
+          <w:p>
+            <w:pPr>
+              <w:spacing w:after="30" w:line="252"/>
+            </w:pPr>
+            <w:r>
+              <w:rPr>
+                <w:rFonts w:ascii="Calibri" w:cs="Calibri" w:eastAsia="Calibri" w:hAnsi="Calibri"/>
+                <w:sz w:val="19"/>
+                <w:szCs w:val="19"/>
+              </w:rPr>
+              <w:t xml:space="preserve">Reversal</w:t>
+            </w:r>
+          </w:p>
+        </w:tc>
+        <w:tc>
+          <w:tcPr>
+            <w:tcW w:type="dxa" w:w="3300"/>
+            <w:tcBorders>
+              <w:top w:val="single" w:color="C9DCE2" w:sz="4"/>
+              <w:left w:val="single" w:color="C9DCE2" w:sz="4"/>
+              <w:bottom w:val="single" w:color="C9DCE2" w:sz="4"/>
+              <w:right w:val="single" w:color="C9DCE2" w:sz="4"/>
+            </w:tcBorders>
+            <w:tcMar>
+              <w:top w:type="dxa" w:w="70"/>
+              <w:left w:type="dxa" w:w="110"/>
+              <w:bottom w:type="dxa" w:w="70"/>
+              <w:right w:type="dxa" w:w="110"/>
+            </w:tcMar>
+            <w:vAlign w:val="top"/>
+          </w:tcPr>
+          <w:p>
+            <w:pPr>
+              <w:spacing w:after="30" w:line="252"/>
+            </w:pPr>
+            <w:r>
+              <w:rPr>
+                <w:rFonts w:ascii="Calibri" w:cs="Calibri" w:eastAsia="Calibri" w:hAnsi="Calibri"/>
+                <w:sz w:val="19"/>
+                <w:szCs w:val="19"/>
+              </w:rPr>
+              <w:t xml:space="preserve">Admin → P4 → ledger + items</w:t>
+            </w:r>
+          </w:p>
+        </w:tc>
+        <w:tc>
+          <w:tcPr>
+            <w:tcW w:type="dxa" w:w="3826"/>
+            <w:tcBorders>
+              <w:top w:val="single" w:color="C9DCE2" w:sz="4"/>
+              <w:left w:val="single" w:color="C9DCE2" w:sz="4"/>
+              <w:bottom w:val="single" w:color="C9DCE2" w:sz="4"/>
+              <w:right w:val="single" w:color="C9DCE2" w:sz="4"/>
+            </w:tcBorders>
+            <w:tcMar>
+              <w:top w:type="dxa" w:w="70"/>
+              <w:left w:type="dxa" w:w="110"/>
+              <w:bottom w:type="dxa" w:w="70"/>
+              <w:right w:type="dxa" w:w="110"/>
+            </w:tcMar>
+            <w:vAlign w:val="top"/>
+          </w:tcPr>
+          <w:p>
+            <w:pPr>
+              <w:spacing w:after="30" w:line="252"/>
+            </w:pPr>
+            <w:r>
+              <w:rPr>
+                <w:rFonts w:ascii="Calibri" w:cs="Calibri" w:eastAsia="Calibri" w:hAnsi="Calibri"/>
+                <w:sz w:val="19"/>
+                <w:szCs w:val="19"/>
+              </w:rPr>
+              <w:t xml:space="preserve">RV entry with opposite quantities; original marked </w:t>
+            </w:r>
+            <w:r>
+              <w:rPr>
+                <w:rFonts w:ascii="Consolas" w:cs="Consolas" w:eastAsia="Consolas" w:hAnsi="Consolas"/>
+                <w:color w:val="186F90"/>
+                <w:sz w:val="18"/>
+                <w:szCs w:val="18"/>
+              </w:rPr>
+              <w:t xml:space="preserve">rev</w:t>
+            </w:r>
+            <w:r>
+              <w:rPr>
+                <w:rFonts w:ascii="Calibri" w:cs="Calibri" w:eastAsia="Calibri" w:hAnsi="Calibri"/>
+                <w:sz w:val="19"/>
+                <w:szCs w:val="19"/>
+              </w:rPr>
+              <w:t xml:space="preserve">.</w:t>
+            </w:r>
+          </w:p>
+        </w:tc>
+      </w:tr>
+      <w:tr>
+        <w:trPr>
+          <w:tblHeader w:val="false"/>
+        </w:trPr>
+        <w:tc>
+          <w:tcPr>
+            <w:tcW w:type="dxa" w:w="1900"/>
+            <w:tcBorders>
+              <w:top w:val="single" w:color="C9DCE2" w:sz="4"/>
+              <w:left w:val="single" w:color="C9DCE2" w:sz="4"/>
+              <w:bottom w:val="single" w:color="C9DCE2" w:sz="4"/>
+              <w:right w:val="single" w:color="C9DCE2" w:sz="4"/>
+            </w:tcBorders>
+            <w:tcMar>
+              <w:top w:type="dxa" w:w="70"/>
+              <w:left w:type="dxa" w:w="110"/>
+              <w:bottom w:type="dxa" w:w="70"/>
+              <w:right w:type="dxa" w:w="110"/>
+            </w:tcMar>
+            <w:vAlign w:val="top"/>
+          </w:tcPr>
+          <w:p>
+            <w:pPr>
+              <w:spacing w:after="30" w:line="252"/>
+            </w:pPr>
+            <w:r>
+              <w:rPr>
+                <w:rFonts w:ascii="Calibri" w:cs="Calibri" w:eastAsia="Calibri" w:hAnsi="Calibri"/>
+                <w:sz w:val="19"/>
+                <w:szCs w:val="19"/>
+              </w:rPr>
+              <w:t xml:space="preserve">Administration</w:t>
+            </w:r>
+          </w:p>
+        </w:tc>
+        <w:tc>
+          <w:tcPr>
+            <w:tcW w:type="dxa" w:w="3300"/>
+            <w:tcBorders>
+              <w:top w:val="single" w:color="C9DCE2" w:sz="4"/>
+              <w:left w:val="single" w:color="C9DCE2" w:sz="4"/>
+              <w:bottom w:val="single" w:color="C9DCE2" w:sz="4"/>
+              <w:right w:val="single" w:color="C9DCE2" w:sz="4"/>
+            </w:tcBorders>
+            <w:tcMar>
+              <w:top w:type="dxa" w:w="70"/>
+              <w:left w:type="dxa" w:w="110"/>
+              <w:bottom w:type="dxa" w:w="70"/>
+              <w:right w:type="dxa" w:w="110"/>
+            </w:tcMar>
+            <w:vAlign w:val="top"/>
+          </w:tcPr>
+          <w:p>
+            <w:pPr>
+              <w:spacing w:after="30" w:line="252"/>
+            </w:pPr>
+            <w:r>
+              <w:rPr>
+                <w:rFonts w:ascii="Calibri" w:cs="Calibri" w:eastAsia="Calibri" w:hAnsi="Calibri"/>
+                <w:sz w:val="19"/>
+                <w:szCs w:val="19"/>
+              </w:rPr>
+              <w:t xml:space="preserve">Admin → P5 → users, config</w:t>
+            </w:r>
+          </w:p>
+        </w:tc>
+        <w:tc>
+          <w:tcPr>
+            <w:tcW w:type="dxa" w:w="3826"/>
+            <w:tcBorders>
+              <w:top w:val="single" w:color="C9DCE2" w:sz="4"/>
+              <w:left w:val="single" w:color="C9DCE2" w:sz="4"/>
+              <w:bottom w:val="single" w:color="C9DCE2" w:sz="4"/>
+              <w:right w:val="single" w:color="C9DCE2" w:sz="4"/>
+            </w:tcBorders>
+            <w:tcMar>
+              <w:top w:type="dxa" w:w="70"/>
+              <w:left w:type="dxa" w:w="110"/>
+              <w:bottom w:type="dxa" w:w="70"/>
+              <w:right w:type="dxa" w:w="110"/>
+            </w:tcMar>
+            <w:vAlign w:val="top"/>
+          </w:tcPr>
+          <w:p>
+            <w:pPr>
+              <w:spacing w:after="30" w:line="252"/>
+            </w:pPr>
+            <w:r>
+              <w:rPr>
+                <w:rFonts w:ascii="Calibri" w:cs="Calibri" w:eastAsia="Calibri" w:hAnsi="Calibri"/>
+                <w:sz w:val="19"/>
+                <w:szCs w:val="19"/>
+              </w:rPr>
+              <w:t xml:space="preserve">Roles, active flag, settings, lists; restore rewrites all collections except users.</w:t>
+            </w:r>
+          </w:p>
+        </w:tc>
+      </w:tr>
+      <w:tr>
+        <w:trPr>
+          <w:tblHeader w:val="false"/>
+        </w:trPr>
+        <w:tc>
+          <w:tcPr>
+            <w:tcW w:type="dxa" w:w="1900"/>
+            <w:tcBorders>
+              <w:top w:val="single" w:color="C9DCE2" w:sz="4"/>
+              <w:left w:val="single" w:color="C9DCE2" w:sz="4"/>
+              <w:bottom w:val="single" w:color="C9DCE2" w:sz="4"/>
+              <w:right w:val="single" w:color="C9DCE2" w:sz="4"/>
+            </w:tcBorders>
+            <w:tcMar>
+              <w:top w:type="dxa" w:w="70"/>
+              <w:left w:type="dxa" w:w="110"/>
+              <w:bottom w:type="dxa" w:w="70"/>
+              <w:right w:type="dxa" w:w="110"/>
+            </w:tcMar>
+            <w:vAlign w:val="top"/>
+          </w:tcPr>
+          <w:p>
+            <w:pPr>
+              <w:spacing w:after="30" w:line="252"/>
+            </w:pPr>
+            <w:r>
+              <w:rPr>
+                <w:rFonts w:ascii="Calibri" w:cs="Calibri" w:eastAsia="Calibri" w:hAnsi="Calibri"/>
+                <w:sz w:val="19"/>
+                <w:szCs w:val="19"/>
+              </w:rPr>
+              <w:t xml:space="preserve">Viewing</w:t>
+            </w:r>
+          </w:p>
+        </w:tc>
+        <w:tc>
+          <w:tcPr>
+            <w:tcW w:type="dxa" w:w="3300"/>
+            <w:tcBorders>
+              <w:top w:val="single" w:color="C9DCE2" w:sz="4"/>
+              <w:left w:val="single" w:color="C9DCE2" w:sz="4"/>
+              <w:bottom w:val="single" w:color="C9DCE2" w:sz="4"/>
+              <w:right w:val="single" w:color="C9DCE2" w:sz="4"/>
+            </w:tcBorders>
+            <w:tcMar>
+              <w:top w:type="dxa" w:w="70"/>
+              <w:left w:type="dxa" w:w="110"/>
+              <w:bottom w:type="dxa" w:w="70"/>
+              <w:right w:type="dxa" w:w="110"/>
+            </w:tcMar>
+            <w:vAlign w:val="top"/>
+          </w:tcPr>
+          <w:p>
+            <w:pPr>
+              <w:spacing w:after="30" w:line="252"/>
+            </w:pPr>
+            <w:r>
+              <w:rPr>
+                <w:rFonts w:ascii="Calibri" w:cs="Calibri" w:eastAsia="Calibri" w:hAnsi="Calibri"/>
+                <w:sz w:val="19"/>
+                <w:szCs w:val="19"/>
+              </w:rPr>
+              <w:t xml:space="preserve">All collections → P6 → user</w:t>
+            </w:r>
+          </w:p>
+        </w:tc>
+        <w:tc>
+          <w:tcPr>
+            <w:tcW w:type="dxa" w:w="3826"/>
+            <w:tcBorders>
+              <w:top w:val="single" w:color="C9DCE2" w:sz="4"/>
+              <w:left w:val="single" w:color="C9DCE2" w:sz="4"/>
+              <w:bottom w:val="single" w:color="C9DCE2" w:sz="4"/>
+              <w:right w:val="single" w:color="C9DCE2" w:sz="4"/>
+            </w:tcBorders>
+            <w:tcMar>
+              <w:top w:type="dxa" w:w="70"/>
+              <w:left w:type="dxa" w:w="110"/>
+              <w:bottom w:type="dxa" w:w="70"/>
+              <w:right w:type="dxa" w:w="110"/>
+            </w:tcMar>
+            <w:vAlign w:val="top"/>
+          </w:tcPr>
+          <w:p>
+            <w:pPr>
+              <w:spacing w:after="30" w:line="252"/>
+            </w:pPr>
+            <w:r>
+              <w:rPr>
+                <w:rFonts w:ascii="Calibri" w:cs="Calibri" w:eastAsia="Calibri" w:hAnsi="Calibri"/>
+                <w:sz w:val="19"/>
+                <w:szCs w:val="19"/>
+              </w:rPr>
+              <w:t xml:space="preserve">Live listeners feed the dashboard, history and reports; exports are saved as files.</w:t>
+            </w:r>
+          </w:p>
+        </w:tc>
+      </w:tr>
+      <w:tr>
+        <w:trPr>
+          <w:tblHeader w:val="false"/>
+        </w:trPr>
+        <w:tc>
+          <w:tcPr>
+            <w:tcW w:type="dxa" w:w="1900"/>
+            <w:tcBorders>
+              <w:top w:val="single" w:color="C9DCE2" w:sz="4"/>
+              <w:left w:val="single" w:color="C9DCE2" w:sz="4"/>
+              <w:bottom w:val="single" w:color="C9DCE2" w:sz="4"/>
+              <w:right w:val="single" w:color="C9DCE2" w:sz="4"/>
+            </w:tcBorders>
+            <w:tcMar>
+              <w:top w:type="dxa" w:w="70"/>
+              <w:left w:type="dxa" w:w="110"/>
+              <w:bottom w:type="dxa" w:w="70"/>
+              <w:right w:type="dxa" w:w="110"/>
+            </w:tcMar>
+            <w:vAlign w:val="top"/>
+          </w:tcPr>
+          <w:p>
+            <w:pPr>
+              <w:spacing w:after="30" w:line="252"/>
+            </w:pPr>
+            <w:r>
+              <w:rPr>
+                <w:rFonts w:ascii="Calibri" w:cs="Calibri" w:eastAsia="Calibri" w:hAnsi="Calibri"/>
+                <w:sz w:val="19"/>
+                <w:szCs w:val="19"/>
+              </w:rPr>
+              <w:t xml:space="preserve">Audit</w:t>
+            </w:r>
+          </w:p>
+        </w:tc>
+        <w:tc>
+          <w:tcPr>
+            <w:tcW w:type="dxa" w:w="3300"/>
+            <w:tcBorders>
+              <w:top w:val="single" w:color="C9DCE2" w:sz="4"/>
+              <w:left w:val="single" w:color="C9DCE2" w:sz="4"/>
+              <w:bottom w:val="single" w:color="C9DCE2" w:sz="4"/>
+              <w:right w:val="single" w:color="C9DCE2" w:sz="4"/>
+            </w:tcBorders>
+            <w:tcMar>
+              <w:top w:type="dxa" w:w="70"/>
+              <w:left w:type="dxa" w:w="110"/>
+              <w:bottom w:type="dxa" w:w="70"/>
+              <w:right w:type="dxa" w:w="110"/>
+            </w:tcMar>
+            <w:vAlign w:val="top"/>
+          </w:tcPr>
+          <w:p>
+            <w:pPr>
+              <w:spacing w:after="30" w:line="252"/>
+            </w:pPr>
+            <w:r>
+              <w:rPr>
+                <w:rFonts w:ascii="Calibri" w:cs="Calibri" w:eastAsia="Calibri" w:hAnsi="Calibri"/>
+                <w:sz w:val="19"/>
+                <w:szCs w:val="19"/>
+              </w:rPr>
+              <w:t xml:space="preserve">Every process → audit</w:t>
+            </w:r>
+          </w:p>
+        </w:tc>
+        <w:tc>
+          <w:tcPr>
+            <w:tcW w:type="dxa" w:w="3826"/>
+            <w:tcBorders>
+              <w:top w:val="single" w:color="C9DCE2" w:sz="4"/>
+              <w:left w:val="single" w:color="C9DCE2" w:sz="4"/>
+              <w:bottom w:val="single" w:color="C9DCE2" w:sz="4"/>
+              <w:right w:val="single" w:color="C9DCE2" w:sz="4"/>
+            </w:tcBorders>
+            <w:tcMar>
+              <w:top w:type="dxa" w:w="70"/>
+              <w:left w:type="dxa" w:w="110"/>
+              <w:bottom w:type="dxa" w:w="70"/>
+              <w:right w:type="dxa" w:w="110"/>
+            </w:tcMar>
+            <w:vAlign w:val="top"/>
+          </w:tcPr>
+          <w:p>
+            <w:pPr>
+              <w:spacing w:after="30" w:line="252"/>
+            </w:pPr>
+            <w:r>
+              <w:rPr>
+                <w:rFonts w:ascii="Calibri" w:cs="Calibri" w:eastAsia="Calibri" w:hAnsi="Calibri"/>
+                <w:sz w:val="19"/>
+                <w:szCs w:val="19"/>
+              </w:rPr>
+              <w:t xml:space="preserve">Daily per-user audit docs (who, what, when); readable by admins only.</w:t>
+            </w:r>
+          </w:p>
+        </w:tc>
+      </w:tr>
+    </w:tbl>
+    <w:p>
+      <w:pPr>
+        <w:spacing w:after="120"/>
       </w:pPr>
     </w:p>
     <w:p>
@@ -11520,6 +12645,70 @@
     </w:p>
     <w:p>
       <w:pPr>
+        <w:keepNext/>
+        <w:spacing w:after="40" w:before="60"/>
+        <w:jc w:val="center"/>
+      </w:pPr>
+      <w:r>
+        <w:drawing>
+          <wp:inline distT="0" distB="0" distL="0" distR="0">
+            <wp:extent cx="5762625" cy="4476750"/>
+            <wp:effectExtent t="0" r="0" b="0" l="0"/>
+            <wp:docPr id="1" name="Figure D. Stock In / Stock Out posting sequence (same path for Opening, Adjustment and Reversal)" descr="Figure D. Stock In / Stock Out posting sequence (same path for Opening, Adjustment and Reversal)" title="Figure D. Stock In / Stock Out posting sequence (same path for Opening, Adjustment and Reversal)"/>
+            <wp:cNvGraphicFramePr>
+              <a:graphicFrameLocks xmlns:a="http://schemas.openxmlformats.org/drawingml/2006/main" noChangeAspect="1"/>
+            </wp:cNvGraphicFramePr>
+            <a:graphic xmlns:a="http://schemas.openxmlformats.org/drawingml/2006/main">
+              <a:graphicData uri="http://schemas.openxmlformats.org/drawingml/2006/picture">
+                <pic:pic xmlns:pic="http://schemas.openxmlformats.org/drawingml/2006/picture">
+                  <pic:nvPicPr>
+                    <pic:cNvPr id="0" name="" descr=""/>
+                    <pic:cNvPicPr>
+                      <a:picLocks noChangeAspect="1" noChangeArrowheads="1"/>
+                    </pic:cNvPicPr>
+                  </pic:nvPicPr>
+                  <pic:blipFill>
+                    <a:blip r:embed="rId14" cstate="none"/>
+                    <a:srcRect/>
+                    <a:stretch>
+                      <a:fillRect/>
+                    </a:stretch>
+                  </pic:blipFill>
+                  <pic:spPr bwMode="auto">
+                    <a:xfrm>
+                      <a:off x="0" y="0"/>
+                      <a:ext cx="5762625" cy="4476750"/>
+                    </a:xfrm>
+                    <a:prstGeom prst="rect">
+                      <a:avLst/>
+                    </a:prstGeom>
+                  </pic:spPr>
+                </pic:pic>
+              </a:graphicData>
+            </a:graphic>
+          </wp:inline>
+        </w:drawing>
+      </w:r>
+    </w:p>
+    <w:p>
+      <w:pPr>
+        <w:spacing w:after="200"/>
+        <w:jc w:val="center"/>
+      </w:pPr>
+      <w:r>
+        <w:rPr>
+          <w:rFonts w:ascii="Calibri" w:cs="Calibri" w:eastAsia="Calibri" w:hAnsi="Calibri"/>
+          <w:i/>
+          <w:iCs/>
+          <w:color w:val="52707A"/>
+          <w:sz w:val="18"/>
+          <w:szCs w:val="18"/>
+        </w:rPr>
+        <w:t xml:space="preserve">Figure D. Stock In / Stock Out posting sequence (same path for Opening, Adjustment and Reversal)</w:t>
+      </w:r>
+    </w:p>
+    <w:p>
+      <w:pPr>
         <w:pStyle w:val="Heading2"/>
       </w:pPr>
       <w:r>
@@ -12365,6 +13554,121 @@
       <w:pPr>
         <w:spacing w:after="120"/>
       </w:pPr>
+    </w:p>
+    <w:p>
+      <w:pPr>
+        <w:pStyle w:val="Heading3"/>
+      </w:pPr>
+      <w:r>
+        <w:rPr>
+          <w:rFonts w:ascii="Calibri" w:cs="Calibri" w:eastAsia="Calibri" w:hAnsi="Calibri"/>
+        </w:rPr>
+        <w:t xml:space="preserve">Adjustment approval flow</w:t>
+      </w:r>
+    </w:p>
+    <w:p>
+      <w:pPr>
+        <w:spacing w:after="120" w:line="288"/>
+      </w:pPr>
+      <w:r>
+        <w:rPr>
+          <w:rFonts w:ascii="Calibri" w:cs="Calibri" w:eastAsia="Calibri" w:hAnsi="Calibri"/>
+        </w:rPr>
+        <w:t xml:space="preserve">When the setting </w:t>
+      </w:r>
+      <w:r>
+        <w:rPr>
+          <w:rFonts w:ascii="Calibri" w:cs="Calibri" w:eastAsia="Calibri" w:hAnsi="Calibri"/>
+          <w:b/>
+          <w:bCs/>
+        </w:rPr>
+        <w:t xml:space="preserve">Adjustments by Inventory Staff need administrator approval</w:t>
+      </w:r>
+      <w:r>
+        <w:rPr>
+          <w:rFonts w:ascii="Calibri" w:cs="Calibri" w:eastAsia="Calibri" w:hAnsi="Calibri"/>
+        </w:rPr>
+        <w:t xml:space="preserve"> is on, a staff count creates a PENDING request; an administrator approves it (which posts an SA entry through </w:t>
+      </w:r>
+      <w:r>
+        <w:rPr>
+          <w:rFonts w:ascii="Consolas" w:cs="Consolas" w:eastAsia="Consolas" w:hAnsi="Consolas"/>
+          <w:color w:val="186F90"/>
+          <w:sz w:val="20"/>
+          <w:szCs w:val="20"/>
+        </w:rPr>
+        <w:t xml:space="preserve">post()</w:t>
+      </w:r>
+      <w:r>
+        <w:rPr>
+          <w:rFonts w:ascii="Calibri" w:cs="Calibri" w:eastAsia="Calibri" w:hAnsi="Calibri"/>
+        </w:rPr>
+        <w:t xml:space="preserve">) or rejects it with a note. Administrators' own adjustments, and all adjustments when approval is off, post immediately.</w:t>
+      </w:r>
+    </w:p>
+    <w:p>
+      <w:pPr>
+        <w:keepNext/>
+        <w:spacing w:after="40" w:before="60"/>
+        <w:jc w:val="center"/>
+      </w:pPr>
+      <w:r>
+        <w:drawing>
+          <wp:inline distT="0" distB="0" distL="0" distR="0">
+            <wp:extent cx="5762625" cy="2971800"/>
+            <wp:effectExtent t="0" r="0" b="0" l="0"/>
+            <wp:docPr id="1" name="Figure E. Stock adjustment request and approval" descr="Figure E. Stock adjustment request and approval" title="Figure E. Stock adjustment request and approval"/>
+            <wp:cNvGraphicFramePr>
+              <a:graphicFrameLocks xmlns:a="http://schemas.openxmlformats.org/drawingml/2006/main" noChangeAspect="1"/>
+            </wp:cNvGraphicFramePr>
+            <a:graphic xmlns:a="http://schemas.openxmlformats.org/drawingml/2006/main">
+              <a:graphicData uri="http://schemas.openxmlformats.org/drawingml/2006/picture">
+                <pic:pic xmlns:pic="http://schemas.openxmlformats.org/drawingml/2006/picture">
+                  <pic:nvPicPr>
+                    <pic:cNvPr id="0" name="" descr=""/>
+                    <pic:cNvPicPr>
+                      <a:picLocks noChangeAspect="1" noChangeArrowheads="1"/>
+                    </pic:cNvPicPr>
+                  </pic:nvPicPr>
+                  <pic:blipFill>
+                    <a:blip r:embed="rId15" cstate="none"/>
+                    <a:srcRect/>
+                    <a:stretch>
+                      <a:fillRect/>
+                    </a:stretch>
+                  </pic:blipFill>
+                  <pic:spPr bwMode="auto">
+                    <a:xfrm>
+                      <a:off x="0" y="0"/>
+                      <a:ext cx="5762625" cy="2971800"/>
+                    </a:xfrm>
+                    <a:prstGeom prst="rect">
+                      <a:avLst/>
+                    </a:prstGeom>
+                  </pic:spPr>
+                </pic:pic>
+              </a:graphicData>
+            </a:graphic>
+          </wp:inline>
+        </w:drawing>
+      </w:r>
+    </w:p>
+    <w:p>
+      <w:pPr>
+        <w:spacing w:after="200"/>
+        <w:jc w:val="center"/>
+      </w:pPr>
+      <w:r>
+        <w:rPr>
+          <w:rFonts w:ascii="Calibri" w:cs="Calibri" w:eastAsia="Calibri" w:hAnsi="Calibri"/>
+          <w:i/>
+          <w:iCs/>
+          <w:color w:val="52707A"/>
+          <w:sz w:val="18"/>
+          <w:szCs w:val="18"/>
+        </w:rPr>
+        <w:t xml:space="preserve">Figure E. Stock adjustment request and approval</w:t>
+      </w:r>
     </w:p>
     <w:p>
       <w:pPr>
@@ -17563,6 +18867,70 @@
       <w:pPr>
         <w:spacing w:after="100"/>
       </w:pPr>
+    </w:p>
+    <w:p>
+      <w:pPr>
+        <w:keepNext/>
+        <w:spacing w:after="40" w:before="60"/>
+        <w:jc w:val="center"/>
+      </w:pPr>
+      <w:r>
+        <w:drawing>
+          <wp:inline distT="0" distB="0" distL="0" distR="0">
+            <wp:extent cx="5762625" cy="2790825"/>
+            <wp:effectExtent t="0" r="0" b="0" l="0"/>
+            <wp:docPr id="1" name="Figure F. Reports, exports, backup and restore data flow" descr="Figure F. Reports, exports, backup and restore data flow" title="Figure F. Reports, exports, backup and restore data flow"/>
+            <wp:cNvGraphicFramePr>
+              <a:graphicFrameLocks xmlns:a="http://schemas.openxmlformats.org/drawingml/2006/main" noChangeAspect="1"/>
+            </wp:cNvGraphicFramePr>
+            <a:graphic xmlns:a="http://schemas.openxmlformats.org/drawingml/2006/main">
+              <a:graphicData uri="http://schemas.openxmlformats.org/drawingml/2006/picture">
+                <pic:pic xmlns:pic="http://schemas.openxmlformats.org/drawingml/2006/picture">
+                  <pic:nvPicPr>
+                    <pic:cNvPr id="0" name="" descr=""/>
+                    <pic:cNvPicPr>
+                      <a:picLocks noChangeAspect="1" noChangeArrowheads="1"/>
+                    </pic:cNvPicPr>
+                  </pic:nvPicPr>
+                  <pic:blipFill>
+                    <a:blip r:embed="rId16" cstate="none"/>
+                    <a:srcRect/>
+                    <a:stretch>
+                      <a:fillRect/>
+                    </a:stretch>
+                  </pic:blipFill>
+                  <pic:spPr bwMode="auto">
+                    <a:xfrm>
+                      <a:off x="0" y="0"/>
+                      <a:ext cx="5762625" cy="2790825"/>
+                    </a:xfrm>
+                    <a:prstGeom prst="rect">
+                      <a:avLst/>
+                    </a:prstGeom>
+                  </pic:spPr>
+                </pic:pic>
+              </a:graphicData>
+            </a:graphic>
+          </wp:inline>
+        </w:drawing>
+      </w:r>
+    </w:p>
+    <w:p>
+      <w:pPr>
+        <w:spacing w:after="200"/>
+        <w:jc w:val="center"/>
+      </w:pPr>
+      <w:r>
+        <w:rPr>
+          <w:rFonts w:ascii="Calibri" w:cs="Calibri" w:eastAsia="Calibri" w:hAnsi="Calibri"/>
+          <w:i/>
+          <w:iCs/>
+          <w:color w:val="52707A"/>
+          <w:sz w:val="18"/>
+          <w:szCs w:val="18"/>
+        </w:rPr>
+        <w:t xml:space="preserve">Figure F. Reports, exports, backup and restore data flow</w:t>
+      </w:r>
     </w:p>
     <w:p>
       <w:pPr>

</xml_diff>